<commit_message>
fix(fe-02): address review round 2
- R2-B1 replace skipAuthRefresh with authFailure 'refresh-then-throw': a 401 on change
  password refreshes once and retries once; a 401 on the retry is shown under Current
  password without signing out; a rejected refresh token still signs out
- R2-M1 hero variant first-package for a member with a card and no package ever; renew
  only after packages were used up or ended
- R2-m1 Active packages hint says how many packages can still be booked
- R2-m2 document that requireNavItem runs at module load and is guarded by tests

Tests: 255 passed in 15 files (13 added in this round), lint, tsc -b and build green.

Co-Authored-By: Claude Opus 5.5 <noreply@anthropic.com>
Claude-Session: https://claude.ai/code/session_012dY14BdCNHi5oMuDrhUi8Y
</commit_message>
<xml_diff>
--- a/docs/audit/FE-02_AI_Audit_Log.docx
+++ b/docs/audit/FE-02_AI_Audit_Log.docx
@@ -3854,7 +3854,7 @@
         <w:pStyle w:val="ListBullet"/>
       </w:pPr>
       <w:r>
-        <w:t>B1 trade-off: with skipAuthRefresh, an access token that expires exactly during the password change also shows "Current password is incorrect" instead of refreshing. The session is kept, and the next normal request refreshes as usual. The preferred BE-02 answer for a wrong current password is still 400 with details.currentPassword, which is shown under the field.</w:t>
+        <w:t>B1 trade-off (corrected in Review Round 2): the round 1 text understated the problem. With skipAuthRefresh every 401 from PUT /users/me/password was shown as "Current password is incorrect", including a 401 caused by an expired access token. My Profile sends no background requests, so a member who stayed on the page longer than the access token lifetime could never change the password: every submit sent the same request with the same expired token and got the same wrong message, even with the correct password. Nothing refreshed the token until the member left the page. Fixed in R2-B1 (section 9) with authFailure refresh-then-throw.</w:t>
       </w:r>
     </w:p>
     <w:p>
@@ -4926,6 +4926,1152 @@
     <w:p>
       <w:r>
         <w:t>Every file changed in round 1 (code, Markdown and the text of this docx) was scanned for non ASCII characters: none found.</w:t>
+      </w:r>
+    </w:p>
+    <w:p>
+      <w:r>
+        <w:br w:type="page"/>
+      </w:r>
+    </w:p>
+    <w:p>
+      <w:pPr>
+        <w:pStyle w:val="Heading1"/>
+      </w:pPr>
+      <w:r>
+        <w:t>9. Review Round 2</w:t>
+      </w:r>
+    </w:p>
+    <w:p>
+      <w:r>
+        <w:t>Date: 2026-10-13. Base: commit 4a733c6 ("fix(fe-02): address review round 1"). The review accepted most of round 1, including the M1 justification, and asked for changes on R2-B1, R2-M1, R2-m1 and R2-m2. Only these items were changed. No backend file, no new dependency, no unrelated refactor.</w:t>
+      </w:r>
+    </w:p>
+    <w:p>
+      <w:pPr>
+        <w:pStyle w:val="Heading2"/>
+      </w:pPr>
+      <w:r>
+        <w:t>9.1 Item map</w:t>
+      </w:r>
+    </w:p>
+    <w:tbl>
+      <w:tblPr>
+        <w:tblStyle w:val="LightGrid-Accent1"/>
+        <w:tblW w:type="auto" w:w="0"/>
+        <w:jc w:val="center"/>
+        <w:tblLook w:firstColumn="1" w:firstRow="1" w:lastColumn="0" w:lastRow="0" w:noHBand="0" w:noVBand="1" w:val="04A0"/>
+      </w:tblPr>
+      <w:tblGrid>
+        <w:gridCol w:w="2160"/>
+        <w:gridCol w:w="2160"/>
+        <w:gridCol w:w="2160"/>
+        <w:gridCol w:w="2160"/>
+      </w:tblGrid>
+      <w:tr>
+        <w:tc>
+          <w:tcPr>
+            <w:tcW w:type="dxa" w:w="2160"/>
+          </w:tcPr>
+          <w:p>
+            <w:r>
+              <w:rPr>
+                <w:b/>
+                <w:sz w:val="18"/>
+              </w:rPr>
+              <w:t>Item</w:t>
+            </w:r>
+          </w:p>
+        </w:tc>
+        <w:tc>
+          <w:tcPr>
+            <w:tcW w:type="dxa" w:w="2160"/>
+          </w:tcPr>
+          <w:p>
+            <w:r>
+              <w:rPr>
+                <w:b/>
+                <w:sz w:val="18"/>
+              </w:rPr>
+              <w:t>What changed</w:t>
+            </w:r>
+          </w:p>
+        </w:tc>
+        <w:tc>
+          <w:tcPr>
+            <w:tcW w:type="dxa" w:w="2160"/>
+          </w:tcPr>
+          <w:p>
+            <w:r>
+              <w:rPr>
+                <w:b/>
+                <w:sz w:val="18"/>
+              </w:rPr>
+              <w:t>Files</w:t>
+            </w:r>
+          </w:p>
+        </w:tc>
+        <w:tc>
+          <w:tcPr>
+            <w:tcW w:type="dxa" w:w="2160"/>
+          </w:tcPr>
+          <w:p>
+            <w:r>
+              <w:rPr>
+                <w:b/>
+                <w:sz w:val="18"/>
+              </w:rPr>
+              <w:t>Tests</w:t>
+            </w:r>
+          </w:p>
+        </w:tc>
+      </w:tr>
+      <w:tr>
+        <w:tc>
+          <w:tcPr>
+            <w:tcW w:type="dxa" w:w="2160"/>
+          </w:tcPr>
+          <w:p>
+            <w:r>
+              <w:rPr>
+                <w:sz w:val="18"/>
+              </w:rPr>
+              <w:t>R2-B1</w:t>
+            </w:r>
+          </w:p>
+        </w:tc>
+        <w:tc>
+          <w:tcPr>
+            <w:tcW w:type="dxa" w:w="2160"/>
+          </w:tcPr>
+          <w:p>
+            <w:r>
+              <w:rPr>
+                <w:sz w:val="18"/>
+              </w:rPr>
+              <w:t>skipAuthRefresh removed (no other user). New RequestOptions.authFailure: "expire-session" (default, unchanged behavior) or "refresh-then-throw". With refresh-then-throw: 1) a 401 refreshes once through the shared single-flight refreshAccessToken and retries once; 2) a 401 on the retry is thrown as ApiError(401), no sign out, no second refresh, shown under Current password; 3) a rejected refresh token keeps the existing sign out; 4) a network or server error during the refresh is thrown without sign out. Only memberApi.changePassword uses it. Comments of passwordFailure and CURRENT_PASSWORD_REJECTED_MESSAGE updated.</w:t>
+            </w:r>
+          </w:p>
+        </w:tc>
+        <w:tc>
+          <w:tcPr>
+            <w:tcW w:type="dxa" w:w="2160"/>
+          </w:tcPr>
+          <w:p>
+            <w:r>
+              <w:rPr>
+                <w:sz w:val="18"/>
+              </w:rPr>
+              <w:t>frontend/src/api/client.ts, frontend/src/api/memberApi.ts, frontend/src/pages/member/MyProfilePage.tsx, frontend/src/pages/member/profileValidation.ts</w:t>
+            </w:r>
+          </w:p>
+        </w:tc>
+        <w:tc>
+          <w:tcPr>
+            <w:tcW w:type="dxa" w:w="2160"/>
+          </w:tcPr>
+          <w:p>
+            <w:r>
+              <w:rPr>
+                <w:sz w:val="18"/>
+              </w:rPr>
+              <w:t>client.test.ts TC-FE02-105 to TC-FE02-109 and TC-FE02-112; myProfile.test.tsx TC-FE02-067 (changed), TC-FE02-080, TC-FE02-081; the 17 FE-00 and FE-01 client tests unchanged</w:t>
+            </w:r>
+          </w:p>
+        </w:tc>
+      </w:tr>
+      <w:tr>
+        <w:tc>
+          <w:tcPr>
+            <w:tcW w:type="dxa" w:w="2160"/>
+          </w:tcPr>
+          <w:p>
+            <w:r>
+              <w:rPr>
+                <w:sz w:val="18"/>
+              </w:rPr>
+              <w:t>R2-M1</w:t>
+            </w:r>
+          </w:p>
+        </w:tc>
+        <w:tc>
+          <w:tcPr>
+            <w:tcW w:type="dxa" w:w="2160"/>
+          </w:tcPr>
+          <w:p>
+            <w:r>
+              <w:rPr>
+                <w:sz w:val="18"/>
+              </w:rPr>
+              <w:t>New hero variant first-package for a member with a paid card who never had a paid package: title "Choose your first sport package.", text with the card discount when a card is in force ("Your VIP card gives you 10% off 30 day and 90 day packages. Pick a sport to start training."), otherwise "Pick a sport and a training style to start training.", action Explore packages. renew is kept only when the member had packages. heroVariant now takes a facts object {state, hasBookablePackage, pendingCount, hasHadPackage}; hasHadPackage (ACTIVE or EXPIRED registrations) is a model helper, so the decision is in the model, not the component.</w:t>
+            </w:r>
+          </w:p>
+        </w:tc>
+        <w:tc>
+          <w:tcPr>
+            <w:tcW w:type="dxa" w:w="2160"/>
+          </w:tcPr>
+          <w:p>
+            <w:r>
+              <w:rPr>
+                <w:sz w:val="18"/>
+              </w:rPr>
+              <w:t>frontend/src/pages/member/dashboardModel.ts, frontend/src/pages/member/MemberDashboardPage.tsx</w:t>
+            </w:r>
+          </w:p>
+        </w:tc>
+        <w:tc>
+          <w:tcPr>
+            <w:tcW w:type="dxa" w:w="2160"/>
+          </w:tcPr>
+          <w:p>
+            <w:r>
+              <w:rPr>
+                <w:sz w:val="18"/>
+              </w:rPr>
+              <w:t>dashboardModel.test.ts TC-FE02-019 (changed), TC-FE02-120, TC-FE02-121; memberDashboard.test.tsx TC-FE02-122, TC-FE02-123; TC-FE02-035 still expects renew for a used up package</w:t>
+            </w:r>
+          </w:p>
+        </w:tc>
+      </w:tr>
+      <w:tr>
+        <w:tc>
+          <w:tcPr>
+            <w:tcW w:type="dxa" w:w="2160"/>
+          </w:tcPr>
+          <w:p>
+            <w:r>
+              <w:rPr>
+                <w:sz w:val="18"/>
+              </w:rPr>
+              <w:t>R2-m1</w:t>
+            </w:r>
+          </w:p>
+        </w:tc>
+        <w:tc>
+          <w:tcPr>
+            <w:tcW w:type="dxa" w:w="2160"/>
+          </w:tcPr>
+          <w:p>
+            <w:r>
+              <w:rPr>
+                <w:sz w:val="18"/>
+              </w:rPr>
+              <w:t>Choice: keep the count and change the hint. The value counts the same packages as the My sport packages list (ACTIVE, not ended), so stat and list agree. When some have no sessions left the hint reads "&lt;n&gt; can be booked - &lt;m&gt; with no sessions left"; otherwise "Your paid sport access". Counting only bookable packages was rejected because the list would then show more packages than the stat.</w:t>
+            </w:r>
+          </w:p>
+        </w:tc>
+        <w:tc>
+          <w:tcPr>
+            <w:tcW w:type="dxa" w:w="2160"/>
+          </w:tcPr>
+          <w:p>
+            <w:r>
+              <w:rPr>
+                <w:sz w:val="18"/>
+              </w:rPr>
+              <w:t>frontend/src/pages/member/MemberDashboardPage.tsx</w:t>
+            </w:r>
+          </w:p>
+        </w:tc>
+        <w:tc>
+          <w:tcPr>
+            <w:tcW w:type="dxa" w:w="2160"/>
+          </w:tcPr>
+          <w:p>
+            <w:r>
+              <w:rPr>
+                <w:sz w:val="18"/>
+              </w:rPr>
+              <w:t>memberDashboard.test.tsx TC-FE02-124, TC-FE02-125</w:t>
+            </w:r>
+          </w:p>
+        </w:tc>
+      </w:tr>
+      <w:tr>
+        <w:tc>
+          <w:tcPr>
+            <w:tcW w:type="dxa" w:w="2160"/>
+          </w:tcPr>
+          <w:p>
+            <w:r>
+              <w:rPr>
+                <w:sz w:val="18"/>
+              </w:rPr>
+              <w:t>R2-m2</w:t>
+            </w:r>
+          </w:p>
+        </w:tc>
+        <w:tc>
+          <w:tcPr>
+            <w:tcW w:type="dxa" w:w="2160"/>
+          </w:tcPr>
+          <w:p>
+            <w:r>
+              <w:rPr>
+                <w:sz w:val="18"/>
+              </w:rPr>
+              <w:t>Kept at module load and documented in AppRoutes.tsx (9.2).</w:t>
+            </w:r>
+          </w:p>
+        </w:tc>
+        <w:tc>
+          <w:tcPr>
+            <w:tcW w:type="dxa" w:w="2160"/>
+          </w:tcPr>
+          <w:p>
+            <w:r>
+              <w:rPr>
+                <w:sz w:val="18"/>
+              </w:rPr>
+              <w:t>frontend/src/routes/AppRoutes.tsx (comment)</w:t>
+            </w:r>
+          </w:p>
+        </w:tc>
+        <w:tc>
+          <w:tcPr>
+            <w:tcW w:type="dxa" w:w="2160"/>
+          </w:tcPr>
+          <w:p>
+            <w:r>
+              <w:rPr>
+                <w:sz w:val="18"/>
+              </w:rPr>
+              <w:t>navigation.test.ts TC-FE02-110, TC-FE02-111; regression 6 in 9.3</w:t>
+            </w:r>
+          </w:p>
+        </w:tc>
+      </w:tr>
+    </w:tbl>
+    <w:p/>
+    <w:p>
+      <w:pPr>
+        <w:pStyle w:val="Heading2"/>
+      </w:pPr>
+      <w:r>
+        <w:t>9.2 Decisions</w:t>
+      </w:r>
+    </w:p>
+    <w:p>
+      <w:pPr>
+        <w:pStyle w:val="ListBullet"/>
+      </w:pPr>
+      <w:r>
+        <w:t>R2-B1: why refresh first. The client cannot tell a 401 for an expired token from a 401 for a wrong password. Refreshing once removes the expired token case: if the retry with a fresh token still answers 401, the 401 is about the request. A rejected refresh token means the session is really over, so the normal sign out stays. Both requests of a parallel burst share one refresh call (refreshAccessToken is single-flight and uses the cross tab lock).</w:t>
+      </w:r>
+    </w:p>
+    <w:p>
+      <w:pPr>
+        <w:pStyle w:val="ListBullet"/>
+      </w:pPr>
+      <w:r>
+        <w:t>R2-B1: remaining limitation. If BE-02 answers 401 for a wrong password, each wrong attempt costs one refresh call and rotates the refresh token. That is harmless but noisy. The preferred contract is still 400 with details.currentPassword.</w:t>
+      </w:r>
+    </w:p>
+    <w:p>
+      <w:pPr>
+        <w:pStyle w:val="ListBullet"/>
+      </w:pPr>
+      <w:r>
+        <w:t>R2-m2: requireNavItem runs when AppRoutes.tsx is loaded, in every build (development, tests and production). MEMBER_AREA is a static constant, so the lookup can only fail after an edit of layouts/navigation.ts. In that case navigation.test.ts fails and every test file that renders the app fails to load (verified: 6 test files failed), so the error is caught before any build ships. Moving the lookup into areaRoutes would only move the same error to the first render, so it stays at module load.</w:t>
+      </w:r>
+    </w:p>
+    <w:p>
+      <w:pPr>
+        <w:pStyle w:val="Heading2"/>
+      </w:pPr>
+      <w:r>
+        <w:t>9.3 Verification</w:t>
+      </w:r>
+    </w:p>
+    <w:tbl>
+      <w:tblPr>
+        <w:tblStyle w:val="LightGrid-Accent1"/>
+        <w:tblW w:type="auto" w:w="0"/>
+        <w:jc w:val="center"/>
+        <w:tblLook w:firstColumn="1" w:firstRow="1" w:lastColumn="0" w:lastRow="0" w:noHBand="0" w:noVBand="1" w:val="04A0"/>
+      </w:tblPr>
+      <w:tblGrid>
+        <w:gridCol w:w="4320"/>
+        <w:gridCol w:w="4320"/>
+      </w:tblGrid>
+      <w:tr>
+        <w:tc>
+          <w:tcPr>
+            <w:tcW w:type="dxa" w:w="4320"/>
+          </w:tcPr>
+          <w:p>
+            <w:r>
+              <w:rPr>
+                <w:b/>
+                <w:sz w:val="18"/>
+              </w:rPr>
+              <w:t>Check</w:t>
+            </w:r>
+          </w:p>
+        </w:tc>
+        <w:tc>
+          <w:tcPr>
+            <w:tcW w:type="dxa" w:w="4320"/>
+          </w:tcPr>
+          <w:p>
+            <w:r>
+              <w:rPr>
+                <w:b/>
+                <w:sz w:val="18"/>
+              </w:rPr>
+              <w:t>Result</w:t>
+            </w:r>
+          </w:p>
+        </w:tc>
+      </w:tr>
+      <w:tr>
+        <w:tc>
+          <w:tcPr>
+            <w:tcW w:type="dxa" w:w="4320"/>
+          </w:tcPr>
+          <w:p>
+            <w:r>
+              <w:rPr>
+                <w:sz w:val="18"/>
+              </w:rPr>
+              <w:t>npm test (vitest run)</w:t>
+            </w:r>
+          </w:p>
+        </w:tc>
+        <w:tc>
+          <w:tcPr>
+            <w:tcW w:type="dxa" w:w="4320"/>
+          </w:tcPr>
+          <w:p>
+            <w:r>
+              <w:rPr>
+                <w:sz w:val="18"/>
+              </w:rPr>
+              <w:t>255 passed in 15 files, 0 failed</w:t>
+            </w:r>
+          </w:p>
+        </w:tc>
+      </w:tr>
+      <w:tr>
+        <w:tc>
+          <w:tcPr>
+            <w:tcW w:type="dxa" w:w="4320"/>
+          </w:tcPr>
+          <w:p>
+            <w:r>
+              <w:rPr>
+                <w:sz w:val="18"/>
+              </w:rPr>
+              <w:t>Tests added in round 2</w:t>
+            </w:r>
+          </w:p>
+        </w:tc>
+        <w:tc>
+          <w:tcPr>
+            <w:tcW w:type="dxa" w:w="4320"/>
+          </w:tcPr>
+          <w:p>
+            <w:r>
+              <w:rPr>
+                <w:sz w:val="18"/>
+              </w:rPr>
+              <w:t>13 net: 14 new (client.test.ts 6, myProfile.test.tsx 2, dashboardModel.test.ts 2, memberDashboard.test.tsx 4), 1 removed (the round 1 client test of skipAuthRefresh, removed with the option)</w:t>
+            </w:r>
+          </w:p>
+        </w:tc>
+      </w:tr>
+      <w:tr>
+        <w:tc>
+          <w:tcPr>
+            <w:tcW w:type="dxa" w:w="4320"/>
+          </w:tcPr>
+          <w:p>
+            <w:r>
+              <w:rPr>
+                <w:sz w:val="18"/>
+              </w:rPr>
+              <w:t>Existing tests changed in round 2</w:t>
+            </w:r>
+          </w:p>
+        </w:tc>
+        <w:tc>
+          <w:tcPr>
+            <w:tcW w:type="dxa" w:w="4320"/>
+          </w:tcPr>
+          <w:p>
+            <w:r>
+              <w:rPr>
+                <w:sz w:val="18"/>
+              </w:rPr>
+              <w:t>myProfile.test.tsx TC-FE02-067 (a 401 now refreshes once and retries; fake backend gained POST /auth/refresh); dashboardModel.test.ts TC-FE02-019 (facts object, one extra assertion); client.test.ts round 1 FE-02 test replaced</w:t>
+            </w:r>
+          </w:p>
+        </w:tc>
+      </w:tr>
+      <w:tr>
+        <w:tc>
+          <w:tcPr>
+            <w:tcW w:type="dxa" w:w="4320"/>
+          </w:tcPr>
+          <w:p>
+            <w:r>
+              <w:rPr>
+                <w:sz w:val="18"/>
+              </w:rPr>
+              <w:t>npm run lint -- --max-warnings 0</w:t>
+            </w:r>
+          </w:p>
+        </w:tc>
+        <w:tc>
+          <w:tcPr>
+            <w:tcW w:type="dxa" w:w="4320"/>
+          </w:tcPr>
+          <w:p>
+            <w:r>
+              <w:rPr>
+                <w:sz w:val="18"/>
+              </w:rPr>
+              <w:t>Passed, 0 warnings</w:t>
+            </w:r>
+          </w:p>
+        </w:tc>
+      </w:tr>
+      <w:tr>
+        <w:tc>
+          <w:tcPr>
+            <w:tcW w:type="dxa" w:w="4320"/>
+          </w:tcPr>
+          <w:p>
+            <w:r>
+              <w:rPr>
+                <w:sz w:val="18"/>
+              </w:rPr>
+              <w:t>tsc -b</w:t>
+            </w:r>
+          </w:p>
+        </w:tc>
+        <w:tc>
+          <w:tcPr>
+            <w:tcW w:type="dxa" w:w="4320"/>
+          </w:tcPr>
+          <w:p>
+            <w:r>
+              <w:rPr>
+                <w:sz w:val="18"/>
+              </w:rPr>
+              <w:t>Passed</w:t>
+            </w:r>
+          </w:p>
+        </w:tc>
+      </w:tr>
+      <w:tr>
+        <w:tc>
+          <w:tcPr>
+            <w:tcW w:type="dxa" w:w="4320"/>
+          </w:tcPr>
+          <w:p>
+            <w:r>
+              <w:rPr>
+                <w:sz w:val="18"/>
+              </w:rPr>
+              <w:t>npm run build</w:t>
+            </w:r>
+          </w:p>
+        </w:tc>
+        <w:tc>
+          <w:tcPr>
+            <w:tcW w:type="dxa" w:w="4320"/>
+          </w:tcPr>
+          <w:p>
+            <w:r>
+              <w:rPr>
+                <w:sz w:val="18"/>
+              </w:rPr>
+              <w:t>Passed</w:t>
+            </w:r>
+          </w:p>
+        </w:tc>
+      </w:tr>
+      <w:tr>
+        <w:tc>
+          <w:tcPr>
+            <w:tcW w:type="dxa" w:w="4320"/>
+          </w:tcPr>
+          <w:p>
+            <w:r>
+              <w:rPr>
+                <w:sz w:val="18"/>
+              </w:rPr>
+              <w:t>Deliberate regressions</w:t>
+            </w:r>
+          </w:p>
+        </w:tc>
+        <w:tc>
+          <w:tcPr>
+            <w:tcW w:type="dxa" w:w="4320"/>
+          </w:tcPr>
+          <w:p>
+            <w:r>
+              <w:rPr>
+                <w:sz w:val="18"/>
+              </w:rPr>
+              <w:t>6 of 6 caught: retry 401 ends session (2 failed), option not passed (1), option skips refresh (8), first-package removed (3), hint always default (1), My Payments entry renamed (navigation test failed, 5 more test files failed to load)</w:t>
+            </w:r>
+          </w:p>
+        </w:tc>
+      </w:tr>
+      <w:tr>
+        <w:tc>
+          <w:tcPr>
+            <w:tcW w:type="dxa" w:w="4320"/>
+          </w:tcPr>
+          <w:p>
+            <w:r>
+              <w:rPr>
+                <w:sz w:val="18"/>
+              </w:rPr>
+              <w:t>Browser</w:t>
+            </w:r>
+          </w:p>
+        </w:tc>
+        <w:tc>
+          <w:tcPr>
+            <w:tcW w:type="dxa" w:w="4320"/>
+          </w:tcPr>
+          <w:p>
+            <w:r>
+              <w:rPr>
+                <w:sz w:val="18"/>
+              </w:rPr>
+              <w:t>Not re-run in round 2; round 1 browser check B10 is superseded and marked so in the test cases</w:t>
+            </w:r>
+          </w:p>
+        </w:tc>
+      </w:tr>
+      <w:tr>
+        <w:tc>
+          <w:tcPr>
+            <w:tcW w:type="dxa" w:w="4320"/>
+          </w:tcPr>
+          <w:p>
+            <w:r>
+              <w:rPr>
+                <w:sz w:val="18"/>
+              </w:rPr>
+              <w:t>Manual cases</w:t>
+            </w:r>
+          </w:p>
+        </w:tc>
+        <w:tc>
+          <w:tcPr>
+            <w:tcW w:type="dxa" w:w="4320"/>
+          </w:tcPr>
+          <w:p>
+            <w:r>
+              <w:rPr>
+                <w:sz w:val="18"/>
+              </w:rPr>
+              <w:t>NOT RUN; M14 added: stay on My Profile longer than the access token lifetime, then change the password with the correct current password -&gt; success</w:t>
+            </w:r>
+          </w:p>
+        </w:tc>
+      </w:tr>
+    </w:tbl>
+    <w:p/>
+    <w:p>
+      <w:pPr>
+        <w:pStyle w:val="Heading2"/>
+      </w:pPr>
+      <w:r>
+        <w:t>9.4 Files changed in round 2</w:t>
+      </w:r>
+    </w:p>
+    <w:tbl>
+      <w:tblPr>
+        <w:tblStyle w:val="LightGrid-Accent1"/>
+        <w:tblW w:type="auto" w:w="0"/>
+        <w:jc w:val="center"/>
+        <w:tblLook w:firstColumn="1" w:firstRow="1" w:lastColumn="0" w:lastRow="0" w:noHBand="0" w:noVBand="1" w:val="04A0"/>
+      </w:tblPr>
+      <w:tblGrid>
+        <w:gridCol w:w="4320"/>
+        <w:gridCol w:w="4320"/>
+      </w:tblGrid>
+      <w:tr>
+        <w:tc>
+          <w:tcPr>
+            <w:tcW w:type="dxa" w:w="4320"/>
+          </w:tcPr>
+          <w:p>
+            <w:r>
+              <w:rPr>
+                <w:b/>
+                <w:sz w:val="18"/>
+              </w:rPr>
+              <w:t>Path</w:t>
+            </w:r>
+          </w:p>
+        </w:tc>
+        <w:tc>
+          <w:tcPr>
+            <w:tcW w:type="dxa" w:w="4320"/>
+          </w:tcPr>
+          <w:p>
+            <w:r>
+              <w:rPr>
+                <w:b/>
+                <w:sz w:val="18"/>
+              </w:rPr>
+              <w:t>Change</w:t>
+            </w:r>
+          </w:p>
+        </w:tc>
+      </w:tr>
+      <w:tr>
+        <w:tc>
+          <w:tcPr>
+            <w:tcW w:type="dxa" w:w="4320"/>
+          </w:tcPr>
+          <w:p>
+            <w:r>
+              <w:rPr>
+                <w:sz w:val="18"/>
+              </w:rPr>
+              <w:t>CHANGELOG.md</w:t>
+            </w:r>
+          </w:p>
+        </w:tc>
+        <w:tc>
+          <w:tcPr>
+            <w:tcW w:type="dxa" w:w="4320"/>
+          </w:tcPr>
+          <w:p>
+            <w:r>
+              <w:rPr>
+                <w:sz w:val="18"/>
+              </w:rPr>
+              <w:t>Modified: Review Fixes (Round 2)</w:t>
+            </w:r>
+          </w:p>
+        </w:tc>
+      </w:tr>
+      <w:tr>
+        <w:tc>
+          <w:tcPr>
+            <w:tcW w:type="dxa" w:w="4320"/>
+          </w:tcPr>
+          <w:p>
+            <w:r>
+              <w:rPr>
+                <w:sz w:val="18"/>
+              </w:rPr>
+              <w:t>docs/audit/FE-02_AI_Audit_Log.docx</w:t>
+            </w:r>
+          </w:p>
+        </w:tc>
+        <w:tc>
+          <w:tcPr>
+            <w:tcW w:type="dxa" w:w="4320"/>
+          </w:tcPr>
+          <w:p>
+            <w:r>
+              <w:rPr>
+                <w:sz w:val="18"/>
+              </w:rPr>
+              <w:t>Modified: section 9, corrected B1 trade-off in 8.2</w:t>
+            </w:r>
+          </w:p>
+        </w:tc>
+      </w:tr>
+      <w:tr>
+        <w:tc>
+          <w:tcPr>
+            <w:tcW w:type="dxa" w:w="4320"/>
+          </w:tcPr>
+          <w:p>
+            <w:r>
+              <w:rPr>
+                <w:sz w:val="18"/>
+              </w:rPr>
+              <w:t>docs/tests/FE-02_test_cases.md</w:t>
+            </w:r>
+          </w:p>
+        </w:tc>
+        <w:tc>
+          <w:tcPr>
+            <w:tcW w:type="dxa" w:w="4320"/>
+          </w:tcPr>
+          <w:p>
+            <w:r>
+              <w:rPr>
+                <w:sz w:val="18"/>
+              </w:rPr>
+              <w:t>Modified</w:t>
+            </w:r>
+          </w:p>
+        </w:tc>
+      </w:tr>
+      <w:tr>
+        <w:tc>
+          <w:tcPr>
+            <w:tcW w:type="dxa" w:w="4320"/>
+          </w:tcPr>
+          <w:p>
+            <w:r>
+              <w:rPr>
+                <w:sz w:val="18"/>
+              </w:rPr>
+              <w:t>frontend/src/api/client.ts</w:t>
+            </w:r>
+          </w:p>
+        </w:tc>
+        <w:tc>
+          <w:tcPr>
+            <w:tcW w:type="dxa" w:w="4320"/>
+          </w:tcPr>
+          <w:p>
+            <w:r>
+              <w:rPr>
+                <w:sz w:val="18"/>
+              </w:rPr>
+              <w:t>Modified: authFailure replaces skipAuthRefresh</w:t>
+            </w:r>
+          </w:p>
+        </w:tc>
+      </w:tr>
+      <w:tr>
+        <w:tc>
+          <w:tcPr>
+            <w:tcW w:type="dxa" w:w="4320"/>
+          </w:tcPr>
+          <w:p>
+            <w:r>
+              <w:rPr>
+                <w:sz w:val="18"/>
+              </w:rPr>
+              <w:t>frontend/src/api/client.test.ts</w:t>
+            </w:r>
+          </w:p>
+        </w:tc>
+        <w:tc>
+          <w:tcPr>
+            <w:tcW w:type="dxa" w:w="4320"/>
+          </w:tcPr>
+          <w:p>
+            <w:r>
+              <w:rPr>
+                <w:sz w:val="18"/>
+              </w:rPr>
+              <w:t>Modified</w:t>
+            </w:r>
+          </w:p>
+        </w:tc>
+      </w:tr>
+      <w:tr>
+        <w:tc>
+          <w:tcPr>
+            <w:tcW w:type="dxa" w:w="4320"/>
+          </w:tcPr>
+          <w:p>
+            <w:r>
+              <w:rPr>
+                <w:sz w:val="18"/>
+              </w:rPr>
+              <w:t>frontend/src/api/memberApi.ts</w:t>
+            </w:r>
+          </w:p>
+        </w:tc>
+        <w:tc>
+          <w:tcPr>
+            <w:tcW w:type="dxa" w:w="4320"/>
+          </w:tcPr>
+          <w:p>
+            <w:r>
+              <w:rPr>
+                <w:sz w:val="18"/>
+              </w:rPr>
+              <w:t>Modified: changePassword uses refresh-then-throw</w:t>
+            </w:r>
+          </w:p>
+        </w:tc>
+      </w:tr>
+      <w:tr>
+        <w:tc>
+          <w:tcPr>
+            <w:tcW w:type="dxa" w:w="4320"/>
+          </w:tcPr>
+          <w:p>
+            <w:r>
+              <w:rPr>
+                <w:sz w:val="18"/>
+              </w:rPr>
+              <w:t>frontend/src/pages/member/MemberDashboardPage.tsx</w:t>
+            </w:r>
+          </w:p>
+        </w:tc>
+        <w:tc>
+          <w:tcPr>
+            <w:tcW w:type="dxa" w:w="4320"/>
+          </w:tcPr>
+          <w:p>
+            <w:r>
+              <w:rPr>
+                <w:sz w:val="18"/>
+              </w:rPr>
+              <w:t>Modified: first-package hero, Active packages hint</w:t>
+            </w:r>
+          </w:p>
+        </w:tc>
+      </w:tr>
+      <w:tr>
+        <w:tc>
+          <w:tcPr>
+            <w:tcW w:type="dxa" w:w="4320"/>
+          </w:tcPr>
+          <w:p>
+            <w:r>
+              <w:rPr>
+                <w:sz w:val="18"/>
+              </w:rPr>
+              <w:t>frontend/src/pages/member/MyProfilePage.tsx</w:t>
+            </w:r>
+          </w:p>
+        </w:tc>
+        <w:tc>
+          <w:tcPr>
+            <w:tcW w:type="dxa" w:w="4320"/>
+          </w:tcPr>
+          <w:p>
+            <w:r>
+              <w:rPr>
+                <w:sz w:val="18"/>
+              </w:rPr>
+              <w:t>Modified: comment of passwordFailure</w:t>
+            </w:r>
+          </w:p>
+        </w:tc>
+      </w:tr>
+      <w:tr>
+        <w:tc>
+          <w:tcPr>
+            <w:tcW w:type="dxa" w:w="4320"/>
+          </w:tcPr>
+          <w:p>
+            <w:r>
+              <w:rPr>
+                <w:sz w:val="18"/>
+              </w:rPr>
+              <w:t>frontend/src/pages/member/dashboardModel.ts</w:t>
+            </w:r>
+          </w:p>
+        </w:tc>
+        <w:tc>
+          <w:tcPr>
+            <w:tcW w:type="dxa" w:w="4320"/>
+          </w:tcPr>
+          <w:p>
+            <w:r>
+              <w:rPr>
+                <w:sz w:val="18"/>
+              </w:rPr>
+              <w:t>Modified: heroVariant facts, hasHadPackage</w:t>
+            </w:r>
+          </w:p>
+        </w:tc>
+      </w:tr>
+      <w:tr>
+        <w:tc>
+          <w:tcPr>
+            <w:tcW w:type="dxa" w:w="4320"/>
+          </w:tcPr>
+          <w:p>
+            <w:r>
+              <w:rPr>
+                <w:sz w:val="18"/>
+              </w:rPr>
+              <w:t>frontend/src/pages/member/dashboardModel.test.ts</w:t>
+            </w:r>
+          </w:p>
+        </w:tc>
+        <w:tc>
+          <w:tcPr>
+            <w:tcW w:type="dxa" w:w="4320"/>
+          </w:tcPr>
+          <w:p>
+            <w:r>
+              <w:rPr>
+                <w:sz w:val="18"/>
+              </w:rPr>
+              <w:t>Modified</w:t>
+            </w:r>
+          </w:p>
+        </w:tc>
+      </w:tr>
+      <w:tr>
+        <w:tc>
+          <w:tcPr>
+            <w:tcW w:type="dxa" w:w="4320"/>
+          </w:tcPr>
+          <w:p>
+            <w:r>
+              <w:rPr>
+                <w:sz w:val="18"/>
+              </w:rPr>
+              <w:t>frontend/src/pages/member/memberDashboard.test.tsx</w:t>
+            </w:r>
+          </w:p>
+        </w:tc>
+        <w:tc>
+          <w:tcPr>
+            <w:tcW w:type="dxa" w:w="4320"/>
+          </w:tcPr>
+          <w:p>
+            <w:r>
+              <w:rPr>
+                <w:sz w:val="18"/>
+              </w:rPr>
+              <w:t>Modified</w:t>
+            </w:r>
+          </w:p>
+        </w:tc>
+      </w:tr>
+      <w:tr>
+        <w:tc>
+          <w:tcPr>
+            <w:tcW w:type="dxa" w:w="4320"/>
+          </w:tcPr>
+          <w:p>
+            <w:r>
+              <w:rPr>
+                <w:sz w:val="18"/>
+              </w:rPr>
+              <w:t>frontend/src/pages/member/myProfile.test.tsx</w:t>
+            </w:r>
+          </w:p>
+        </w:tc>
+        <w:tc>
+          <w:tcPr>
+            <w:tcW w:type="dxa" w:w="4320"/>
+          </w:tcPr>
+          <w:p>
+            <w:r>
+              <w:rPr>
+                <w:sz w:val="18"/>
+              </w:rPr>
+              <w:t>Modified</w:t>
+            </w:r>
+          </w:p>
+        </w:tc>
+      </w:tr>
+      <w:tr>
+        <w:tc>
+          <w:tcPr>
+            <w:tcW w:type="dxa" w:w="4320"/>
+          </w:tcPr>
+          <w:p>
+            <w:r>
+              <w:rPr>
+                <w:sz w:val="18"/>
+              </w:rPr>
+              <w:t>frontend/src/pages/member/profileValidation.ts</w:t>
+            </w:r>
+          </w:p>
+        </w:tc>
+        <w:tc>
+          <w:tcPr>
+            <w:tcW w:type="dxa" w:w="4320"/>
+          </w:tcPr>
+          <w:p>
+            <w:r>
+              <w:rPr>
+                <w:sz w:val="18"/>
+              </w:rPr>
+              <w:t>Modified: comment of CURRENT_PASSWORD_REJECTED_MESSAGE</w:t>
+            </w:r>
+          </w:p>
+        </w:tc>
+      </w:tr>
+      <w:tr>
+        <w:tc>
+          <w:tcPr>
+            <w:tcW w:type="dxa" w:w="4320"/>
+          </w:tcPr>
+          <w:p>
+            <w:r>
+              <w:rPr>
+                <w:sz w:val="18"/>
+              </w:rPr>
+              <w:t>frontend/src/routes/AppRoutes.tsx</w:t>
+            </w:r>
+          </w:p>
+        </w:tc>
+        <w:tc>
+          <w:tcPr>
+            <w:tcW w:type="dxa" w:w="4320"/>
+          </w:tcPr>
+          <w:p>
+            <w:r>
+              <w:rPr>
+                <w:sz w:val="18"/>
+              </w:rPr>
+              <w:t>Modified: comment on module load</w:t>
+            </w:r>
+          </w:p>
+        </w:tc>
+      </w:tr>
+    </w:tbl>
+    <w:p/>
+    <w:p>
+      <w:pPr>
+        <w:pStyle w:val="Heading2"/>
+      </w:pPr>
+      <w:r>
+        <w:t>9.5 Open questions for the backend team</w:t>
+      </w:r>
+    </w:p>
+    <w:p>
+      <w:pPr>
+        <w:pStyle w:val="ListBullet"/>
+      </w:pPr>
+      <w:r>
+        <w:t>BE-02 PUT /users/me/password: please answer a wrong current password with 400 and details.currentPassword. A 401 works, but each wrong attempt then costs one token refresh.</w:t>
+      </w:r>
+    </w:p>
+    <w:p>
+      <w:pPr>
+        <w:pStyle w:val="ListBullet"/>
+      </w:pPr>
+      <w:r>
+        <w:t>BE-02 PUT /users/me and GET /users/me: same questions as 8.5 (body, null phone, answer, extra profile fields).</w:t>
+      </w:r>
+    </w:p>
+    <w:p>
+      <w:pPr>
+        <w:pStyle w:val="ListBullet"/>
+      </w:pPr>
+      <w:r>
+        <w:t>BE-12: GET /bookings/my?when=UPCOMING.</w:t>
+      </w:r>
+    </w:p>
+    <w:p>
+      <w:pPr>
+        <w:pStyle w:val="ListBullet"/>
+      </w:pPr>
+      <w:r>
+        <w:t>Figma gaps: Notifications, Recommended for you, AI Assistant (F1-07) and Interested sports (F1-08).</w:t>
+      </w:r>
+    </w:p>
+    <w:p>
+      <w:pPr>
+        <w:pStyle w:val="Heading2"/>
+      </w:pPr>
+      <w:r>
+        <w:t>9.6 Character scan</w:t>
+      </w:r>
+    </w:p>
+    <w:p>
+      <w:r>
+        <w:t>Every file changed in round 2 (code, Markdown and the text of this docx) was scanned for non ASCII characters: none found.</w:t>
       </w:r>
     </w:p>
     <w:sectPr>

</xml_diff>

<commit_message>
fix(fe-02): address review round 3
- R3-m1 discount wording kept (documented in docs/database/09 lines 149 to 153);
  new cardDiscountText shared by the tier hint and the first-package hero
- R3-doc open question on refresh token revocation by PUT /users/me/password

Tests: 257 passed in 15 files (2 added, 1 changed), lint, tsc -b and build green.

Co-Authored-By: Claude Opus 5.5 <noreply@anthropic.com>
Claude-Session: https://claude.ai/code/session_012dY14BdCNHi5oMuDrhUi8Y
</commit_message>
<xml_diff>
--- a/docs/audit/FE-02_AI_Audit_Log.docx
+++ b/docs/audit/FE-02_AI_Audit_Log.docx
@@ -6072,6 +6072,789 @@
     <w:p>
       <w:r>
         <w:t>Every file changed in round 2 (code, Markdown and the text of this docx) was scanned for non ASCII characters: none found.</w:t>
+      </w:r>
+    </w:p>
+    <w:p>
+      <w:r>
+        <w:br w:type="page"/>
+      </w:r>
+    </w:p>
+    <w:p>
+      <w:pPr>
+        <w:pStyle w:val="Heading1"/>
+      </w:pPr>
+      <w:r>
+        <w:t>10. Review Round 3</w:t>
+      </w:r>
+    </w:p>
+    <w:p>
+      <w:r>
+        <w:t>Date: 2026-10-13. Base: commit 1bf329e ("fix(fe-02): address review round 2"). Review round 3 approved the work with one small fix (R3-m1) and one documentation addition (R3-doc). Only these were changed.</w:t>
+      </w:r>
+    </w:p>
+    <w:p>
+      <w:pPr>
+        <w:pStyle w:val="Heading2"/>
+      </w:pPr>
+      <w:r>
+        <w:t>10.1 Item map</w:t>
+      </w:r>
+    </w:p>
+    <w:tbl>
+      <w:tblPr>
+        <w:tblStyle w:val="LightGrid-Accent1"/>
+        <w:tblW w:type="auto" w:w="0"/>
+        <w:jc w:val="center"/>
+        <w:tblLook w:firstColumn="1" w:firstRow="1" w:lastColumn="0" w:lastRow="0" w:noHBand="0" w:noVBand="1" w:val="04A0"/>
+      </w:tblPr>
+      <w:tblGrid>
+        <w:gridCol w:w="2160"/>
+        <w:gridCol w:w="2160"/>
+        <w:gridCol w:w="2160"/>
+        <w:gridCol w:w="2160"/>
+      </w:tblGrid>
+      <w:tr>
+        <w:tc>
+          <w:tcPr>
+            <w:tcW w:type="dxa" w:w="2160"/>
+          </w:tcPr>
+          <w:p>
+            <w:r>
+              <w:rPr>
+                <w:b/>
+                <w:sz w:val="18"/>
+              </w:rPr>
+              <w:t>Item</w:t>
+            </w:r>
+          </w:p>
+        </w:tc>
+        <w:tc>
+          <w:tcPr>
+            <w:tcW w:type="dxa" w:w="2160"/>
+          </w:tcPr>
+          <w:p>
+            <w:r>
+              <w:rPr>
+                <w:b/>
+                <w:sz w:val="18"/>
+              </w:rPr>
+              <w:t>What changed</w:t>
+            </w:r>
+          </w:p>
+        </w:tc>
+        <w:tc>
+          <w:tcPr>
+            <w:tcW w:type="dxa" w:w="2160"/>
+          </w:tcPr>
+          <w:p>
+            <w:r>
+              <w:rPr>
+                <w:b/>
+                <w:sz w:val="18"/>
+              </w:rPr>
+              <w:t>Files</w:t>
+            </w:r>
+          </w:p>
+        </w:tc>
+        <w:tc>
+          <w:tcPr>
+            <w:tcW w:type="dxa" w:w="2160"/>
+          </w:tcPr>
+          <w:p>
+            <w:r>
+              <w:rPr>
+                <w:b/>
+                <w:sz w:val="18"/>
+              </w:rPr>
+              <w:t>Tests</w:t>
+            </w:r>
+          </w:p>
+        </w:tc>
+      </w:tr>
+      <w:tr>
+        <w:tc>
+          <w:tcPr>
+            <w:tcW w:type="dxa" w:w="2160"/>
+          </w:tcPr>
+          <w:p>
+            <w:r>
+              <w:rPr>
+                <w:sz w:val="18"/>
+              </w:rPr>
+              <w:t>R3-m1</w:t>
+            </w:r>
+          </w:p>
+        </w:tc>
+        <w:tc>
+          <w:tcPr>
+            <w:tcW w:type="dxa" w:w="2160"/>
+          </w:tcPr>
+          <w:p>
+            <w:r>
+              <w:rPr>
+                <w:sz w:val="18"/>
+              </w:rPr>
+              <w:t>Source of the rule found, so the wording "off 30 day and 90 day packages" is kept. New helper cardDiscountText(discountPercentage) in the model returns "&lt;n&gt;% off 30 day and 90 day packages" and is used by both cardHint (tier stat hint, was "&lt;n&gt;% off packages") and firstPackageText (first-package hero), so the two texts agree.</w:t>
+            </w:r>
+          </w:p>
+        </w:tc>
+        <w:tc>
+          <w:tcPr>
+            <w:tcW w:type="dxa" w:w="2160"/>
+          </w:tcPr>
+          <w:p>
+            <w:r>
+              <w:rPr>
+                <w:sz w:val="18"/>
+              </w:rPr>
+              <w:t>frontend/src/pages/member/dashboardModel.ts, frontend/src/pages/member/MemberDashboardPage.tsx</w:t>
+            </w:r>
+          </w:p>
+        </w:tc>
+        <w:tc>
+          <w:tcPr>
+            <w:tcW w:type="dxa" w:w="2160"/>
+          </w:tcPr>
+          <w:p>
+            <w:r>
+              <w:rPr>
+                <w:sz w:val="18"/>
+              </w:rPr>
+              <w:t>TC-FE02-021 (changed: hint text), TC-FE02-122 (unchanged, same text), TC-FE02-126 and TC-FE02-127 (new)</w:t>
+            </w:r>
+          </w:p>
+        </w:tc>
+      </w:tr>
+      <w:tr>
+        <w:tc>
+          <w:tcPr>
+            <w:tcW w:type="dxa" w:w="2160"/>
+          </w:tcPr>
+          <w:p>
+            <w:r>
+              <w:rPr>
+                <w:sz w:val="18"/>
+              </w:rPr>
+              <w:t>R3-doc</w:t>
+            </w:r>
+          </w:p>
+        </w:tc>
+        <w:tc>
+          <w:tcPr>
+            <w:tcW w:type="dxa" w:w="2160"/>
+          </w:tcPr>
+          <w:p>
+            <w:r>
+              <w:rPr>
+                <w:sz w:val="18"/>
+              </w:rPr>
+              <w:t>Open question added about refresh token revocation by PUT /users/me/password (10.3), in this log, in docs/tests/FE-02_test_cases.md section 6 and in the PR description draft.</w:t>
+            </w:r>
+          </w:p>
+        </w:tc>
+        <w:tc>
+          <w:tcPr>
+            <w:tcW w:type="dxa" w:w="2160"/>
+          </w:tcPr>
+          <w:p>
+            <w:r>
+              <w:rPr>
+                <w:sz w:val="18"/>
+              </w:rPr>
+              <w:t>docs/audit/FE-02_AI_Audit_Log.docx, docs/tests/FE-02_test_cases.md, CHANGELOG.md</w:t>
+            </w:r>
+          </w:p>
+        </w:tc>
+        <w:tc>
+          <w:tcPr>
+            <w:tcW w:type="dxa" w:w="2160"/>
+          </w:tcPr>
+          <w:p>
+            <w:r>
+              <w:rPr>
+                <w:sz w:val="18"/>
+              </w:rPr>
+              <w:t>-</w:t>
+            </w:r>
+          </w:p>
+        </w:tc>
+      </w:tr>
+    </w:tbl>
+    <w:p/>
+    <w:p>
+      <w:pPr>
+        <w:pStyle w:val="Heading2"/>
+      </w:pPr>
+      <w:r>
+        <w:t>10.2 Evidence for R3-m1</w:t>
+      </w:r>
+    </w:p>
+    <w:p>
+      <w:pPr>
+        <w:pStyle w:val="ListBullet"/>
+      </w:pPr>
+      <w:r>
+        <w:t>docs/database/09-business-rules-and-state-machines.md line 149: Gold Card, 5% discount on 30-day and 90-day packages. Line 150: VIP Card, 10% discount on 30-day and 90-day packages. Line 152: single-visit packages (1 day, 1 session) are strictly excluded from discounts. Line 153: discounts apply only to 30-day and 90-day packages.</w:t>
+      </w:r>
+    </w:p>
+    <w:p>
+      <w:pPr>
+        <w:pStyle w:val="ListBullet"/>
+      </w:pPr>
+      <w:r>
+        <w:t>Difference found in the backend code: backend/src/main/java/com/sportify/catalog/service/impl/MembershipCardServiceImpl.java lines 275 to 279 (getApplicableDiscountPercentage) only return 0 for packages of 1 day or less; any longer package gets the card discount. SportPackageServiceImpl.java line 139 calls it with the package duration. The seeded packages (V12__align_sport_package_seed_with_figma.sql) are 1, 30 and 90 days, so today the documented rule and the code give the same result, but a 60-day package created by a manager would be discounted. The frontend follows the documented rule; the difference is listed as an open question (10.3).</w:t>
+      </w:r>
+    </w:p>
+    <w:p>
+      <w:pPr>
+        <w:pStyle w:val="Heading2"/>
+      </w:pPr>
+      <w:r>
+        <w:t>10.3 Open questions for the backend team (added in round 3)</w:t>
+      </w:r>
+    </w:p>
+    <w:p>
+      <w:pPr>
+        <w:pStyle w:val="ListBullet"/>
+      </w:pPr>
+      <w:r>
+        <w:t>Does PUT /users/me/password revoke existing refresh tokens? If it does, the member is signed out at the next refresh after a successful change; the frontend should then tell the member and send them to login right after the change.</w:t>
+      </w:r>
+    </w:p>
+    <w:p>
+      <w:pPr>
+        <w:pStyle w:val="ListBullet"/>
+      </w:pPr>
+      <w:r>
+        <w:t>Discount rule: the documentation says 30-day and 90-day packages only, the code excludes only packages of 1 day or less. Which one is the rule?</w:t>
+      </w:r>
+    </w:p>
+    <w:p>
+      <w:pPr>
+        <w:pStyle w:val="ListBullet"/>
+      </w:pPr>
+      <w:r>
+        <w:t>Still open from 8.5 and 9.5: BE-02 contract of PUT /users/me, GET /users/me fields, preferred 400 for a wrong current password, BE-12 when=UPCOMING, Figma gaps (Notifications, Recommended for you, AI Assistant, Interested sports).</w:t>
+      </w:r>
+    </w:p>
+    <w:p>
+      <w:pPr>
+        <w:pStyle w:val="Heading2"/>
+      </w:pPr>
+      <w:r>
+        <w:t>10.4 Verification</w:t>
+      </w:r>
+    </w:p>
+    <w:tbl>
+      <w:tblPr>
+        <w:tblStyle w:val="LightGrid-Accent1"/>
+        <w:tblW w:type="auto" w:w="0"/>
+        <w:jc w:val="center"/>
+        <w:tblLook w:firstColumn="1" w:firstRow="1" w:lastColumn="0" w:lastRow="0" w:noHBand="0" w:noVBand="1" w:val="04A0"/>
+      </w:tblPr>
+      <w:tblGrid>
+        <w:gridCol w:w="4320"/>
+        <w:gridCol w:w="4320"/>
+      </w:tblGrid>
+      <w:tr>
+        <w:tc>
+          <w:tcPr>
+            <w:tcW w:type="dxa" w:w="4320"/>
+          </w:tcPr>
+          <w:p>
+            <w:r>
+              <w:rPr>
+                <w:b/>
+                <w:sz w:val="18"/>
+              </w:rPr>
+              <w:t>Check</w:t>
+            </w:r>
+          </w:p>
+        </w:tc>
+        <w:tc>
+          <w:tcPr>
+            <w:tcW w:type="dxa" w:w="4320"/>
+          </w:tcPr>
+          <w:p>
+            <w:r>
+              <w:rPr>
+                <w:b/>
+                <w:sz w:val="18"/>
+              </w:rPr>
+              <w:t>Result</w:t>
+            </w:r>
+          </w:p>
+        </w:tc>
+      </w:tr>
+      <w:tr>
+        <w:tc>
+          <w:tcPr>
+            <w:tcW w:type="dxa" w:w="4320"/>
+          </w:tcPr>
+          <w:p>
+            <w:r>
+              <w:rPr>
+                <w:sz w:val="18"/>
+              </w:rPr>
+              <w:t>npm test (vitest run)</w:t>
+            </w:r>
+          </w:p>
+        </w:tc>
+        <w:tc>
+          <w:tcPr>
+            <w:tcW w:type="dxa" w:w="4320"/>
+          </w:tcPr>
+          <w:p>
+            <w:r>
+              <w:rPr>
+                <w:sz w:val="18"/>
+              </w:rPr>
+              <w:t>257 passed in 15 files, 0 failed</w:t>
+            </w:r>
+          </w:p>
+        </w:tc>
+      </w:tr>
+      <w:tr>
+        <w:tc>
+          <w:tcPr>
+            <w:tcW w:type="dxa" w:w="4320"/>
+          </w:tcPr>
+          <w:p>
+            <w:r>
+              <w:rPr>
+                <w:sz w:val="18"/>
+              </w:rPr>
+              <w:t>Tests added in round 3</w:t>
+            </w:r>
+          </w:p>
+        </w:tc>
+        <w:tc>
+          <w:tcPr>
+            <w:tcW w:type="dxa" w:w="4320"/>
+          </w:tcPr>
+          <w:p>
+            <w:r>
+              <w:rPr>
+                <w:sz w:val="18"/>
+              </w:rPr>
+              <w:t>2: TC-FE02-126 (memberDashboard.test.tsx), TC-FE02-127 (dashboardModel.test.ts)</w:t>
+            </w:r>
+          </w:p>
+        </w:tc>
+      </w:tr>
+      <w:tr>
+        <w:tc>
+          <w:tcPr>
+            <w:tcW w:type="dxa" w:w="4320"/>
+          </w:tcPr>
+          <w:p>
+            <w:r>
+              <w:rPr>
+                <w:sz w:val="18"/>
+              </w:rPr>
+              <w:t>Existing tests changed in round 3</w:t>
+            </w:r>
+          </w:p>
+        </w:tc>
+        <w:tc>
+          <w:tcPr>
+            <w:tcW w:type="dxa" w:w="4320"/>
+          </w:tcPr>
+          <w:p>
+            <w:r>
+              <w:rPr>
+                <w:sz w:val="18"/>
+              </w:rPr>
+              <w:t>memberDashboard.test.tsx TC-FE02-021: the tier hint text now includes the durations</w:t>
+            </w:r>
+          </w:p>
+        </w:tc>
+      </w:tr>
+      <w:tr>
+        <w:tc>
+          <w:tcPr>
+            <w:tcW w:type="dxa" w:w="4320"/>
+          </w:tcPr>
+          <w:p>
+            <w:r>
+              <w:rPr>
+                <w:sz w:val="18"/>
+              </w:rPr>
+              <w:t>npm run lint -- --max-warnings 0</w:t>
+            </w:r>
+          </w:p>
+        </w:tc>
+        <w:tc>
+          <w:tcPr>
+            <w:tcW w:type="dxa" w:w="4320"/>
+          </w:tcPr>
+          <w:p>
+            <w:r>
+              <w:rPr>
+                <w:sz w:val="18"/>
+              </w:rPr>
+              <w:t>Passed, 0 warnings</w:t>
+            </w:r>
+          </w:p>
+        </w:tc>
+      </w:tr>
+      <w:tr>
+        <w:tc>
+          <w:tcPr>
+            <w:tcW w:type="dxa" w:w="4320"/>
+          </w:tcPr>
+          <w:p>
+            <w:r>
+              <w:rPr>
+                <w:sz w:val="18"/>
+              </w:rPr>
+              <w:t>tsc -b</w:t>
+            </w:r>
+          </w:p>
+        </w:tc>
+        <w:tc>
+          <w:tcPr>
+            <w:tcW w:type="dxa" w:w="4320"/>
+          </w:tcPr>
+          <w:p>
+            <w:r>
+              <w:rPr>
+                <w:sz w:val="18"/>
+              </w:rPr>
+              <w:t>Passed</w:t>
+            </w:r>
+          </w:p>
+        </w:tc>
+      </w:tr>
+      <w:tr>
+        <w:tc>
+          <w:tcPr>
+            <w:tcW w:type="dxa" w:w="4320"/>
+          </w:tcPr>
+          <w:p>
+            <w:r>
+              <w:rPr>
+                <w:sz w:val="18"/>
+              </w:rPr>
+              <w:t>npm run build</w:t>
+            </w:r>
+          </w:p>
+        </w:tc>
+        <w:tc>
+          <w:tcPr>
+            <w:tcW w:type="dxa" w:w="4320"/>
+          </w:tcPr>
+          <w:p>
+            <w:r>
+              <w:rPr>
+                <w:sz w:val="18"/>
+              </w:rPr>
+              <w:t>Passed</w:t>
+            </w:r>
+          </w:p>
+        </w:tc>
+      </w:tr>
+      <w:tr>
+        <w:tc>
+          <w:tcPr>
+            <w:tcW w:type="dxa" w:w="4320"/>
+          </w:tcPr>
+          <w:p>
+            <w:r>
+              <w:rPr>
+                <w:sz w:val="18"/>
+              </w:rPr>
+              <w:t>Manual cases</w:t>
+            </w:r>
+          </w:p>
+        </w:tc>
+        <w:tc>
+          <w:tcPr>
+            <w:tcW w:type="dxa" w:w="4320"/>
+          </w:tcPr>
+          <w:p>
+            <w:r>
+              <w:rPr>
+                <w:sz w:val="18"/>
+              </w:rPr>
+              <w:t>14 still NOT RUN (BE-02 not merged, no SQL Server in the AI workspace)</w:t>
+            </w:r>
+          </w:p>
+        </w:tc>
+      </w:tr>
+    </w:tbl>
+    <w:p/>
+    <w:p>
+      <w:pPr>
+        <w:pStyle w:val="Heading2"/>
+      </w:pPr>
+      <w:r>
+        <w:t>10.5 Files changed in round 3</w:t>
+      </w:r>
+    </w:p>
+    <w:tbl>
+      <w:tblPr>
+        <w:tblStyle w:val="LightGrid-Accent1"/>
+        <w:tblW w:type="auto" w:w="0"/>
+        <w:jc w:val="center"/>
+        <w:tblLook w:firstColumn="1" w:firstRow="1" w:lastColumn="0" w:lastRow="0" w:noHBand="0" w:noVBand="1" w:val="04A0"/>
+      </w:tblPr>
+      <w:tblGrid>
+        <w:gridCol w:w="4320"/>
+        <w:gridCol w:w="4320"/>
+      </w:tblGrid>
+      <w:tr>
+        <w:tc>
+          <w:tcPr>
+            <w:tcW w:type="dxa" w:w="4320"/>
+          </w:tcPr>
+          <w:p>
+            <w:r>
+              <w:rPr>
+                <w:b/>
+                <w:sz w:val="18"/>
+              </w:rPr>
+              <w:t>Path</w:t>
+            </w:r>
+          </w:p>
+        </w:tc>
+        <w:tc>
+          <w:tcPr>
+            <w:tcW w:type="dxa" w:w="4320"/>
+          </w:tcPr>
+          <w:p>
+            <w:r>
+              <w:rPr>
+                <w:b/>
+                <w:sz w:val="18"/>
+              </w:rPr>
+              <w:t>Change</w:t>
+            </w:r>
+          </w:p>
+        </w:tc>
+      </w:tr>
+      <w:tr>
+        <w:tc>
+          <w:tcPr>
+            <w:tcW w:type="dxa" w:w="4320"/>
+          </w:tcPr>
+          <w:p>
+            <w:r>
+              <w:rPr>
+                <w:sz w:val="18"/>
+              </w:rPr>
+              <w:t>CHANGELOG.md</w:t>
+            </w:r>
+          </w:p>
+        </w:tc>
+        <w:tc>
+          <w:tcPr>
+            <w:tcW w:type="dxa" w:w="4320"/>
+          </w:tcPr>
+          <w:p>
+            <w:r>
+              <w:rPr>
+                <w:sz w:val="18"/>
+              </w:rPr>
+              <w:t>Modified: Review Fixes (Round 3)</w:t>
+            </w:r>
+          </w:p>
+        </w:tc>
+      </w:tr>
+      <w:tr>
+        <w:tc>
+          <w:tcPr>
+            <w:tcW w:type="dxa" w:w="4320"/>
+          </w:tcPr>
+          <w:p>
+            <w:r>
+              <w:rPr>
+                <w:sz w:val="18"/>
+              </w:rPr>
+              <w:t>docs/audit/FE-02_AI_Audit_Log.docx</w:t>
+            </w:r>
+          </w:p>
+        </w:tc>
+        <w:tc>
+          <w:tcPr>
+            <w:tcW w:type="dxa" w:w="4320"/>
+          </w:tcPr>
+          <w:p>
+            <w:r>
+              <w:rPr>
+                <w:sz w:val="18"/>
+              </w:rPr>
+              <w:t>Modified: section 10</w:t>
+            </w:r>
+          </w:p>
+        </w:tc>
+      </w:tr>
+      <w:tr>
+        <w:tc>
+          <w:tcPr>
+            <w:tcW w:type="dxa" w:w="4320"/>
+          </w:tcPr>
+          <w:p>
+            <w:r>
+              <w:rPr>
+                <w:sz w:val="18"/>
+              </w:rPr>
+              <w:t>docs/tests/FE-02_test_cases.md</w:t>
+            </w:r>
+          </w:p>
+        </w:tc>
+        <w:tc>
+          <w:tcPr>
+            <w:tcW w:type="dxa" w:w="4320"/>
+          </w:tcPr>
+          <w:p>
+            <w:r>
+              <w:rPr>
+                <w:sz w:val="18"/>
+              </w:rPr>
+              <w:t>Modified: round 3 cases, section 6 open questions</w:t>
+            </w:r>
+          </w:p>
+        </w:tc>
+      </w:tr>
+      <w:tr>
+        <w:tc>
+          <w:tcPr>
+            <w:tcW w:type="dxa" w:w="4320"/>
+          </w:tcPr>
+          <w:p>
+            <w:r>
+              <w:rPr>
+                <w:sz w:val="18"/>
+              </w:rPr>
+              <w:t>frontend/src/pages/member/dashboardModel.ts</w:t>
+            </w:r>
+          </w:p>
+        </w:tc>
+        <w:tc>
+          <w:tcPr>
+            <w:tcW w:type="dxa" w:w="4320"/>
+          </w:tcPr>
+          <w:p>
+            <w:r>
+              <w:rPr>
+                <w:sz w:val="18"/>
+              </w:rPr>
+              <w:t>Modified: cardDiscountText</w:t>
+            </w:r>
+          </w:p>
+        </w:tc>
+      </w:tr>
+      <w:tr>
+        <w:tc>
+          <w:tcPr>
+            <w:tcW w:type="dxa" w:w="4320"/>
+          </w:tcPr>
+          <w:p>
+            <w:r>
+              <w:rPr>
+                <w:sz w:val="18"/>
+              </w:rPr>
+              <w:t>frontend/src/pages/member/dashboardModel.test.ts</w:t>
+            </w:r>
+          </w:p>
+        </w:tc>
+        <w:tc>
+          <w:tcPr>
+            <w:tcW w:type="dxa" w:w="4320"/>
+          </w:tcPr>
+          <w:p>
+            <w:r>
+              <w:rPr>
+                <w:sz w:val="18"/>
+              </w:rPr>
+              <w:t>Modified: TC-FE02-127</w:t>
+            </w:r>
+          </w:p>
+        </w:tc>
+      </w:tr>
+      <w:tr>
+        <w:tc>
+          <w:tcPr>
+            <w:tcW w:type="dxa" w:w="4320"/>
+          </w:tcPr>
+          <w:p>
+            <w:r>
+              <w:rPr>
+                <w:sz w:val="18"/>
+              </w:rPr>
+              <w:t>frontend/src/pages/member/MemberDashboardPage.tsx</w:t>
+            </w:r>
+          </w:p>
+        </w:tc>
+        <w:tc>
+          <w:tcPr>
+            <w:tcW w:type="dxa" w:w="4320"/>
+          </w:tcPr>
+          <w:p>
+            <w:r>
+              <w:rPr>
+                <w:sz w:val="18"/>
+              </w:rPr>
+              <w:t>Modified: cardHint and firstPackageText use cardDiscountText</w:t>
+            </w:r>
+          </w:p>
+        </w:tc>
+      </w:tr>
+      <w:tr>
+        <w:tc>
+          <w:tcPr>
+            <w:tcW w:type="dxa" w:w="4320"/>
+          </w:tcPr>
+          <w:p>
+            <w:r>
+              <w:rPr>
+                <w:sz w:val="18"/>
+              </w:rPr>
+              <w:t>frontend/src/pages/member/memberDashboard.test.tsx</w:t>
+            </w:r>
+          </w:p>
+        </w:tc>
+        <w:tc>
+          <w:tcPr>
+            <w:tcW w:type="dxa" w:w="4320"/>
+          </w:tcPr>
+          <w:p>
+            <w:r>
+              <w:rPr>
+                <w:sz w:val="18"/>
+              </w:rPr>
+              <w:t>Modified: TC-FE02-021, TC-FE02-126</w:t>
+            </w:r>
+          </w:p>
+        </w:tc>
+      </w:tr>
+    </w:tbl>
+    <w:p/>
+    <w:p>
+      <w:pPr>
+        <w:pStyle w:val="Heading2"/>
+      </w:pPr>
+      <w:r>
+        <w:t>10.6 Character scan</w:t>
+      </w:r>
+    </w:p>
+    <w:p>
+      <w:r>
+        <w:t>Every file changed in round 3 (code, Markdown and the text of this docx) was scanned for non ASCII characters: none found.</w:t>
+      </w:r>
+    </w:p>
+    <w:p>
+      <w:pPr>
+        <w:pStyle w:val="Heading2"/>
+      </w:pPr>
+      <w:r>
+        <w:t>10.7 Observation: timing sensitive FE-01 tests under heavy load (not changed)</w:t>
+      </w:r>
+    </w:p>
+    <w:p>
+      <w:r>
+        <w:t>While checking the patch on a fresh clone of main, one run right after npm ci failed 1 of 257 tests: the FE-01 test "session only tab of member X follows a remembered login of member Y to the member home with a notice" did not find the heading "Member Dashboard" within the default 1000 ms of findByRole. Three more runs on that clone and ten runs on the branch passed 257 of 257. With four full test runs started in parallel on the same machine (12 runs in total), 11 passed and 1 failed 7 FE-01 tests in authScreens.test.tsx, including sign up tests that do not open the dashboard, so the cause is CPU starvation hitting the default findBy and test timeouts. The same load on main (157 tests, 12 runs) passed every time; the FE-02 suite has 100 more tests, and /member now renders the real dashboard instead of a placeholder, which adds work to that FE-01 test. Review round 3 asked for no other change, so these tests were not touched. Suggested follow-up, outside FE-02: give the N1 tests a longer findBy timeout or set testTimeout in the Vitest config, if CI shows the same flake.</w:t>
       </w:r>
     </w:p>
     <w:sectPr>

</xml_diff>